<commit_message>
Store daily recap Word us_market_recap_2026-10-27_BJT_us_2026-10-26_final
</commit_message>
<xml_diff>
--- a/reports/us_market_recap_2026-10-27_BJT_us_2026-10-26_final.docx
+++ b/reports/us_market_recap_2026-10-27_BJT_us_2026-10-26_final.docx
@@ -1013,7 +1013,7 @@
                 <w:color w:val="141414"/>
                 <w:sz w:val="16"/>
               </w:rPr>
-              <w:t>102.03 / 101.43 / 8.00万美元</w:t>
+              <w:t>102.01 / 101.35 / 8.02万美元</w:t>
             </w:r>
           </w:p>
         </w:tc>
@@ -1040,7 +1040,7 @@
                 <w:color w:val="141414"/>
                 <w:sz w:val="16"/>
               </w:rPr>
-              <w:t>DXY +0.22% / WTI -1.78% / BTC -0.03%</w:t>
+              <w:t>DXY +0.19% / WTI -1.86% / BTC +0.17%</w:t>
             </w:r>
           </w:p>
         </w:tc>
@@ -3824,7 +3824,7 @@
                 <w:color w:val="141414"/>
                 <w:sz w:val="16"/>
               </w:rPr>
-              <w:t>价格 -13.15%；成交 2.45x均量</w:t>
+              <w:t>价格 -13.15%；成交 2.35x均量</w:t>
             </w:r>
           </w:p>
         </w:tc>
@@ -3935,7 +3935,7 @@
                 <w:color w:val="141414"/>
                 <w:sz w:val="16"/>
               </w:rPr>
-              <w:t>价格 +8.19%；成交 1.23x均量</w:t>
+              <w:t>价格 +8.19%；成交 1.17x均量</w:t>
             </w:r>
           </w:p>
         </w:tc>
@@ -4046,7 +4046,7 @@
                 <w:color w:val="141414"/>
                 <w:sz w:val="16"/>
               </w:rPr>
-              <w:t>价格 +6.56%；成交 1.11x均量</w:t>
+              <w:t>价格 +6.56%；成交 1.20x均量</w:t>
             </w:r>
           </w:p>
         </w:tc>
@@ -4157,7 +4157,7 @@
                 <w:color w:val="141414"/>
                 <w:sz w:val="16"/>
               </w:rPr>
-              <w:t>价格 +6.19%；成交 0.83x均量</w:t>
+              <w:t>价格 +6.19%；成交 0.74x均量</w:t>
             </w:r>
           </w:p>
         </w:tc>
@@ -4268,7 +4268,7 @@
                 <w:color w:val="141414"/>
                 <w:sz w:val="16"/>
               </w:rPr>
-              <w:t>价格 +6.14%；成交 0.92x均量</w:t>
+              <w:t>价格 +6.14%；成交 1.59x均量</w:t>
             </w:r>
           </w:p>
         </w:tc>
@@ -4379,7 +4379,7 @@
                 <w:color w:val="141414"/>
                 <w:sz w:val="16"/>
               </w:rPr>
-              <w:t>价格 +5.83%；成交 1.05x均量</w:t>
+              <w:t>价格 +5.83%；成交 0.92x均量</w:t>
             </w:r>
           </w:p>
         </w:tc>
@@ -4893,7 +4893,7 @@
         <w:t>FICO</w:t>
       </w:r>
       <w:r>
-        <w:t xml:space="preserve"> -13.15%（成交约2.45x均量）；</w:t>
+        <w:t xml:space="preserve"> -13.15%（成交约2.35x均量）；</w:t>
       </w:r>
       <w:r>
         <w:rPr>
@@ -4902,7 +4902,7 @@
         <w:t>LITE</w:t>
       </w:r>
       <w:r>
-        <w:t xml:space="preserve"> +8.19%（成交约1.23x均量）；</w:t>
+        <w:t xml:space="preserve"> +8.19%（成交约1.17x均量）；</w:t>
       </w:r>
       <w:r>
         <w:rPr>
@@ -4911,7 +4911,7 @@
         <w:t>AAOI</w:t>
       </w:r>
       <w:r>
-        <w:t xml:space="preserve"> +6.56%（成交约1.11x均量）；</w:t>
+        <w:t xml:space="preserve"> +6.56%（成交约1.20x均量）；</w:t>
       </w:r>
       <w:r>
         <w:rPr>
@@ -4920,7 +4920,7 @@
         <w:t>ARM</w:t>
       </w:r>
       <w:r>
-        <w:t xml:space="preserve"> +6.19%（成交约0.83x均量）；</w:t>
+        <w:t xml:space="preserve"> +6.19%（成交约0.74x均量）；</w:t>
       </w:r>
       <w:r>
         <w:rPr>
@@ -4929,7 +4929,7 @@
         <w:t>NOK</w:t>
       </w:r>
       <w:r>
-        <w:t xml:space="preserve"> +6.14%（成交约0.92x均量）；</w:t>
+        <w:t xml:space="preserve"> +6.14%（成交约1.59x均量）；</w:t>
       </w:r>
       <w:r>
         <w:rPr>
@@ -4938,7 +4938,7 @@
         <w:t>COHR</w:t>
       </w:r>
       <w:r>
-        <w:t xml:space="preserve"> +5.83%（成交约1.05x均量）。这些名字先记录为价格/成交异常，随后核对同日公告、研报、公司交流、行业数据或传闻原始出处；没有证据时保留“待验”，不把涨跌倒推成原因。</w:t>
+        <w:t xml:space="preserve"> +5.83%（成交约0.92x均量）。这些名字先记录为价格/成交异常，随后核对同日公告、研报、公司交流、行业数据或传闻原始出处；没有证据时保留“待验”，不把涨跌倒推成原因。</w:t>
       </w:r>
     </w:p>
     <w:p>
@@ -6257,7 +6257,7 @@
                 <w:color w:val="141414"/>
                 <w:sz w:val="16"/>
               </w:rPr>
-              <w:t>2.45x均量</w:t>
+              <w:t>2.35x均量</w:t>
             </w:r>
           </w:p>
         </w:tc>
@@ -6368,7 +6368,7 @@
                 <w:color w:val="141414"/>
                 <w:sz w:val="16"/>
               </w:rPr>
-              <w:t>0.72x均量</w:t>
+              <w:t>0.64x均量</w:t>
             </w:r>
           </w:p>
         </w:tc>
@@ -6479,7 +6479,7 @@
                 <w:color w:val="141414"/>
                 <w:sz w:val="16"/>
               </w:rPr>
-              <w:t>1.68x均量</w:t>
+              <w:t>2.13x均量</w:t>
             </w:r>
           </w:p>
         </w:tc>
@@ -6590,7 +6590,7 @@
                 <w:color w:val="141414"/>
                 <w:sz w:val="16"/>
               </w:rPr>
-              <w:t>0.62x均量</w:t>
+              <w:t>0.59x均量</w:t>
             </w:r>
           </w:p>
         </w:tc>
@@ -6701,7 +6701,7 @@
                 <w:color w:val="141414"/>
                 <w:sz w:val="16"/>
               </w:rPr>
-              <w:t>0.66x均量</w:t>
+              <w:t>0.57x均量</w:t>
             </w:r>
           </w:p>
         </w:tc>
@@ -6812,7 +6812,7 @@
                 <w:color w:val="141414"/>
                 <w:sz w:val="16"/>
               </w:rPr>
-              <w:t>1.12x均量</w:t>
+              <w:t>0.90x均量</w:t>
             </w:r>
           </w:p>
         </w:tc>
@@ -9085,7 +9085,7 @@
           <w:color w:val="555555"/>
           <w:sz w:val="17"/>
         </w:rPr>
-        <w:t>图：公开期权链异常扫描。来源/口径：Nasdaq public option-chain endpoint；检查时点 2026-10-26T19:44:49-04:00；无执行方向确认。。</w:t>
+        <w:t>图：公开期权链异常扫描。来源/口径：Nasdaq public option-chain endpoint；检查时点 2026-10-26T20:20:36-04:00；无执行方向确认。。</w:t>
       </w:r>
     </w:p>
     <w:p>

</xml_diff>